<commit_message>
Add date line and Sources section to quantum hardware approaches doc
Adds an "Updated June 2026" version line under the subtitle and a Sources
section listing the primary/secondary references for each physical-to-logical
ratio figure, plus a caveat that headline ratios are from memory/shallow-circuit
demonstrations.
</commit_message>
<xml_diff>
--- a/Quantum_Computing_Hardware_Approaches_updated.docx
+++ b/Quantum_Computing_Hardware_Approaches_updated.docx
@@ -18,6 +18,15 @@
           <w:sz w:val="26"/>
         </w:rPr>
         <w:t>A plain-language guide for non-specialists</w:t>
+      </w:r>
+    </w:p>
+    <w:p>
+      <w:r>
+        <w:rPr>
+          <w:i/>
+          <w:sz w:val="20"/>
+        </w:rPr>
+        <w:t>Updated June 2026 · ratio figures reflect the best public demonstrations through late 2025</w:t>
       </w:r>
     </w:p>
     <w:p>
@@ -526,6 +535,79 @@
         <w:t>As the ratios above show, every platform is now racing not simply to build more physical qubits, but to drive the physical-to-logical ratio down — extracting more reliable logical qubits from fewer noisy physical ones. As of late 2025, trapped ions (Quantinuum, ~2:1) and neutral atoms (QuEra, ~4.7:1 at the largest scale) report the most efficient published ratios; superconducting qubits are improving quickly through new quantum-LDPC codes; photonic and silicon-spin systems have not yet published comparable demonstrations. One important caveat: these headline ratios come from memory and relatively shallow error-corrected demonstrations — running a long, deep algorithm to a very low error rate still requires a larger ratio than the best single-number figures suggest. Whoever can produce logical qubits efficiently, reliably, and at large scale will win the broader race toward useful, fault-tolerant quantum computing.</w:t>
       </w:r>
     </w:p>
+    <w:p>
+      <w:pPr>
+        <w:pStyle w:val="Heading1"/>
+      </w:pPr>
+      <w:r>
+        <w:t>Sources</w:t>
+      </w:r>
+    </w:p>
+    <w:p>
+      <w:r>
+        <w:rPr>
+          <w:i/>
+        </w:rPr>
+        <w:t>Physical-to-logical ratio figures are taken from the following primary and reputable secondary sources (most recent demonstrations as of mid-2026):</w:t>
+      </w:r>
+    </w:p>
+    <w:p>
+      <w:pPr>
+        <w:pStyle w:val="ListBullet"/>
+      </w:pPr>
+      <w:r>
+        <w:t>Trapped ions (Quantinuum Helios, Nov 2025, ~2:1): Quantinuum, “Introducing Helios: The Most Accurate Quantum Computer in the World” (company blog &amp; press release, 5 Nov 2025); reported in The Quantum Insider and The Wall Street Journal.</w:t>
+      </w:r>
+    </w:p>
+    <w:p>
+      <w:pPr>
+        <w:pStyle w:val="ListBullet"/>
+      </w:pPr>
+      <w:r>
+        <w:t>Neutral atoms (QuEra / Harvard / MIT, Nov 2025, 96 logical / 448 physical, ~4.7:1): “A fault-tolerant neutral-atom architecture for universal quantum computation,” Nature (2025), DOI 10.1038/s41586-025-09848-5; summarized by The Quantum Insider.</w:t>
+      </w:r>
+    </w:p>
+    <w:p>
+      <w:pPr>
+        <w:pStyle w:val="ListBullet"/>
+      </w:pPr>
+      <w:r>
+        <w:t>Neutral atoms — prior milestone (2023, 48 logical / 280 physical, ~6:1): Bluvstein et al., “Logical quantum processor based on reconfigurable atom arrays,” Nature 626 (2023).</w:t>
+      </w:r>
+    </w:p>
+    <w:p>
+      <w:pPr>
+        <w:pStyle w:val="ListBullet"/>
+      </w:pPr>
+      <w:r>
+        <w:t>Superconducting — Google Willow (2024, ~101:1 at code distance 7): Google Quantum AI, “Quantum error correction below the surface code threshold,” Nature (2024).</w:t>
+      </w:r>
+    </w:p>
+    <w:p>
+      <w:pPr>
+        <w:pStyle w:val="ListBullet"/>
+      </w:pPr>
+      <w:r>
+        <w:t>Superconducting — IBM qLDPC “bivariate bicycle” / gross code (2024, ~24:1) and fault-tolerance roadmap (Kookaburra 2026, Starling 2029): IBM Quantum, “IBM lays out clear path to fault-tolerant quantum computing” (IBM Quantum blog, 2025) and the IBM Technology Atlas Quantum Roadmap.</w:t>
+      </w:r>
+    </w:p>
+    <w:p>
+      <w:pPr>
+        <w:pStyle w:val="ListBullet"/>
+      </w:pPr>
+      <w:r>
+        <w:t>Trapped ions — prior milestone (2024, 4 logical / 30 physical, ~7.5:1, 800× error reduction): Quantinuum &amp; Microsoft demonstration on the Quantinuum H2 system (2024).</w:t>
+      </w:r>
+    </w:p>
+    <w:p>
+      <w:r>
+        <w:rPr>
+          <w:i/>
+          <w:sz w:val="20"/>
+        </w:rPr>
+        <w:t>Note: headline ratios above are drawn from quantum-memory and relatively shallow error-corrected demonstrations. The physical-to-logical ratio required to run a long, deep algorithm to a very low logical error rate is higher than these best-case single-number figures, and all figures are expected to keep falling as physical qubits and error-correcting codes improve.</w:t>
+      </w:r>
+    </w:p>
     <w:sectPr>
       <w:pgSz w:w="12240" w:h="15840"/>
       <w:pgMar w:top="1440" w:right="1800" w:bottom="1440" w:left="1800" w:header="720" w:footer="720" w:gutter="0"/>

</xml_diff>

<commit_message>
Sharpen memory-vs-computation caveat in quantum hardware doc
Makes explicit that headline ratios (2:1, 4.7:1) are quantum-memory and
shallow-circuit demonstrations, not planning figures for real chemical or
biological simulations, which are deep computations requiring far lower
logical error rates and therefore many more physical qubits per logical qubit.
</commit_message>
<xml_diff>
--- a/Quantum_Computing_Hardware_Approaches_updated.docx
+++ b/Quantum_Computing_Hardware_Approaches_updated.docx
@@ -520,7 +520,7 @@
         <w:pStyle w:val="Heading1"/>
       </w:pPr>
       <w:r>
-        <w:t>Where Things Stand Today</w:t>
+        <w:t>As the ratios above show, every platform is now racing not simply to build more physical qubits, but to drive the physical-to-logical ratio down — extracting more reliable logical qubits from fewer noisy physical ones. As of late 2025, trapped ions (Quantinuum, ~2:1) and neutral atoms (QuEra, ~4.7:1 at the largest scale) report the most efficient published ratios; superconducting qubits are improving quickly through new quantum-LDPC codes; photonic and silicon-spin systems have not yet published comparable demonstrations. A crucial caveat, however: these headline ratios come from quantum-memory tests (simply storing a logical qubit and keeping it error-corrected over time) and from relatively short, shallow circuits. They are not the ratios needed to run a real computation. A useful chemistry or biology simulation — for example, computing the electronic ground state of a mutated protein site — is a long, deep calculation of many thousands to millions of sequential logical operations, and errors accumulate across every one of them. Reaching the very low error rate such a calculation requires demands far more physical qubits per logical qubit than a memory test: realistically tens, hundreds, or more — not 2:1. In other words, a 2:1 ratio is a remarkable milestone for the field, but it is not a planning figure for practical chemical or biological problems. Whoever can produce logical qubits efficiently, reliably, and at the scale and depth real computations demand will win the broader race toward useful, fault-tolerant quantum computing.</w:t>
       </w:r>
     </w:p>
     <w:p>
@@ -605,7 +605,7 @@
           <w:i/>
           <w:sz w:val="20"/>
         </w:rPr>
-        <w:t>Note: headline ratios above are drawn from quantum-memory and relatively shallow error-corrected demonstrations. The physical-to-logical ratio required to run a long, deep algorithm to a very low logical error rate is higher than these best-case single-number figures, and all figures are expected to keep falling as physical qubits and error-correcting codes improve.</w:t>
+        <w:t>Note: the headline ratios above (e.g., 2:1, 4.7:1) come from quantum-memory demonstrations — storing and error-correcting a logical qubit — and from shallow test circuits. They are best-case milestones, not the ratios required to run a real, deep computation. A practical chemical or biological simulation requires a much lower logical error rate, and therefore many more physical qubits per logical qubit (realistically tens to hundreds or more, depending on the algorithm, its depth, and the target accuracy). All figures are expected to keep improving as physical qubits and error-correcting codes mature.</w:t>
       </w:r>
     </w:p>
     <w:sectPr>

</xml_diff>

<commit_message>
Add Infleqtion to neutral-atom section of quantum hardware doc
Lists Infleqtion among the leading neutral-atom companies and notes its
Feb 2026 NYSE listing (INFQ) as a commercial milestone, with the caveat
that a public listing reflects business momentum rather than computational
performance.
</commit_message>
<xml_diff>
--- a/Quantum_Computing_Hardware_Approaches_updated.docx
+++ b/Quantum_Computing_Hardware_Approaches_updated.docx
@@ -268,7 +268,7 @@
           <w:i/>
           <w:color w:val="555555"/>
         </w:rPr>
-        <w:t>Leading companies: QuEra, Atom Computing, Pasqal</w:t>
+        <w:t>Leading companies: QuEra, Atom Computing, Pasqal, Infleqtion</w:t>
       </w:r>
     </w:p>
     <w:p>
@@ -330,7 +330,7 @@
         <w:t xml:space="preserve">Physical-to-logical qubit ratio (best public demonstration to date): </w:t>
       </w:r>
       <w:r>
-        <w:t>In November 2025, a Harvard/MIT team working with QuEra demonstrated 96 logical qubits encoded in 448 physical atoms (a ratio of about 4.7:1) using a high-rate [[16,6,4]] quantum-LDPC code, published in Nature — the largest logical-qubit count shown on any platform to date, running deep error-corrected circuits with below-threshold error suppression. This roughly doubled the same collaboration's landmark 2023 result of 48 logical qubits from 280 physical atoms (about 6:1). Neutral atoms combine large scale with reconfigurable connectivity, though their physical gate fidelities currently trail those of trapped ions, which is why they use somewhat more physical qubits per logical qubit.</w:t>
+        <w:t>In November 2025, a Harvard/MIT team working with QuEra demonstrated 96 logical qubits encoded in 448 physical atoms (a ratio of about 4.7:1) using a high-rate [[16,6,4]] quantum-LDPC code, published in Nature — the largest logical-qubit count shown on any platform to date, running deep error-corrected circuits with below-threshold error suppression. This roughly doubled the same collaboration's landmark 2023 result of 48 logical qubits from 280 physical atoms (about 6:1). Neutral atoms combine large scale with reconfigurable connectivity, though their physical gate fidelities currently trail those of trapped ions, which is why they use somewhat more physical qubits per logical qubit. On the commercial side, Infleqtion (formerly ColdQuanta) became the first neutral-atom quantum company to list publicly, trading on the NYSE under the ticker INFQ from February 2026 — a sign of the modality's growing commercial momentum, though public listing is a business milestone rather than a measure of computational performance.</w:t>
       </w:r>
     </w:p>
     <w:p>

</xml_diff>